<commit_message>
Doc login finalizado close #4
</commit_message>
<xml_diff>
--- a/Documento de login.docx
+++ b/Documento de login.docx
@@ -28,21 +28,95 @@
     </w:p>
     <w:p/>
     <w:p>
+      <w:r>
+        <w:t xml:space="preserve">Verificar o site do </w:t>
+      </w:r>
+      <w:proofErr w:type="spellStart"/>
+      <w:r>
+        <w:t>firebase</w:t>
+      </w:r>
+      <w:proofErr w:type="spellEnd"/>
+      <w:r>
+        <w:t xml:space="preserve"> para ver se é </w:t>
+      </w:r>
+      <w:proofErr w:type="spellStart"/>
+      <w:r>
+        <w:t>free</w:t>
+      </w:r>
+      <w:proofErr w:type="spellEnd"/>
+      <w:r>
+        <w:t>\</w:t>
+      </w:r>
+    </w:p>
+    <w:p>
       <w:pPr>
         <w:rPr>
           <w:u w:val="single"/>
         </w:rPr>
       </w:pPr>
-      <w:r>
-        <w:t xml:space="preserve">Verificar o site do </w:t>
-      </w:r>
+    </w:p>
+    <w:p>
+      <w:pPr>
+        <w:rPr>
+          <w:u w:val="single"/>
+        </w:rPr>
+      </w:pPr>
+    </w:p>
+    <w:p>
+      <w:pPr>
+        <w:rPr>
+          <w:u w:val="single"/>
+        </w:rPr>
+      </w:pPr>
+      <w:r>
+        <w:rPr>
+          <w:u w:val="single"/>
+        </w:rPr>
+        <w:t>Finalizado Documento de Login</w:t>
+      </w:r>
+    </w:p>
+    <w:p>
+      <w:pPr>
+        <w:rPr>
+          <w:u w:val="single"/>
+        </w:rPr>
+      </w:pPr>
       <w:proofErr w:type="spellStart"/>
       <w:r>
-        <w:t>firebase</w:t>
+        <w:rPr>
+          <w:u w:val="single"/>
+        </w:rPr>
+        <w:t>By</w:t>
       </w:r>
       <w:proofErr w:type="spellEnd"/>
       <w:r>
-        <w:t xml:space="preserve"> para ver se é free\</w:t>
+        <w:rPr>
+          <w:u w:val="single"/>
+        </w:rPr>
+        <w:t xml:space="preserve"> Isaque </w:t>
+      </w:r>
+      <w:proofErr w:type="spellStart"/>
+      <w:r>
+        <w:rPr>
+          <w:u w:val="single"/>
+        </w:rPr>
+        <w:t>Tanno</w:t>
+      </w:r>
+      <w:proofErr w:type="spellEnd"/>
+    </w:p>
+    <w:p>
+      <w:pPr>
+        <w:rPr>
+          <w:u w:val="single"/>
+        </w:rPr>
+      </w:pPr>
+    </w:p>
+    <w:p>
+      <w:r>
+        <w:rPr>
+          <w:u w:val="single"/>
+        </w:rPr>
+        <w:t>20/03/2026</w:t>
       </w:r>
       <w:bookmarkStart w:id="0" w:name="_GoBack"/>
       <w:bookmarkEnd w:id="0"/>

</xml_diff>